<commit_message>
fix: remove FMCSA and SDDC credentials from master resume (company certs, not personal)
</commit_message>
<xml_diff>
--- a/public/Jimmy_Chamberlin_Master_Resume.docx
+++ b/public/Jimmy_Chamberlin_Master_Resume.docx
@@ -550,44 +550,6 @@
     </w:p>
     <w:p>
       <w:pPr>
-        <w:spacing w:after="0"/>
-      </w:pPr>
-      <w:r>
-        <w:rPr>
-          <w:rFonts w:ascii="Calibri" w:hAnsi="Calibri"/>
-          <w:b/>
-          <w:sz w:val="19"/>
-        </w:rPr>
-        <w:t>FMCSA Broker Authority (MC-2979)</w:t>
-      </w:r>
-      <w:r>
-        <w:rPr>
-          <w:sz w:val="18"/>
-        </w:rPr>
-        <w:t xml:space="preserve">  —  Secured and maintained, 2017–2020</w:t>
-      </w:r>
-    </w:p>
-    <w:p>
-      <w:pPr>
-        <w:spacing w:after="0"/>
-      </w:pPr>
-      <w:r>
-        <w:rPr>
-          <w:rFonts w:ascii="Calibri" w:hAnsi="Calibri"/>
-          <w:b/>
-          <w:sz w:val="19"/>
-        </w:rPr>
-        <w:t>SDDC DoD Certified Carrier Operations</w:t>
-      </w:r>
-      <w:r>
-        <w:rPr>
-          <w:sz w:val="18"/>
-        </w:rPr>
-        <w:t xml:space="preserve">  —  J&amp;J Auto Express, 2017–2020</w:t>
-      </w:r>
-    </w:p>
-    <w:p>
-      <w:pPr>
         <w:spacing w:before="160" w:after="40"/>
         <w:pBdr>
           <w:bottom w:val="single" w:sz="4" w:space="1" w:color="1a568b"/>

</xml_diff>

<commit_message>
fix: rename MMCC to Computer Service Intern; add Best Buy Advanced Repair Agent (Feb 2013–May 2014)
</commit_message>
<xml_diff>
--- a/public/Jimmy_Chamberlin_Master_Resume.docx
+++ b/public/Jimmy_Chamberlin_Master_Resume.docx
@@ -389,7 +389,89 @@
           <w:b/>
           <w:sz w:val="21"/>
         </w:rPr>
-        <w:t>IT Systems Administrator — Automation &amp; Endpoint Management</w:t>
+        <w:t>Advanced Repair Agent</w:t>
+      </w:r>
+      <w:r>
+        <w:rPr>
+          <w:sz w:val="20"/>
+        </w:rPr>
+        <w:t xml:space="preserve">  |  Best Buy / Geek Squad</w:t>
+      </w:r>
+    </w:p>
+    <w:p>
+      <w:pPr>
+        <w:spacing w:after="20"/>
+      </w:pPr>
+      <w:r>
+        <w:rPr>
+          <w:rFonts w:ascii="Calibri" w:hAnsi="Calibri"/>
+          <w:color w:val="555555"/>
+          <w:sz w:val="19"/>
+        </w:rPr>
+        <w:t>Feb 2013 – May 2014</w:t>
+      </w:r>
+      <w:r>
+        <w:rPr>
+          <w:rFonts w:ascii="Calibri" w:hAnsi="Calibri"/>
+          <w:color w:val="777777"/>
+          <w:sz w:val="18"/>
+        </w:rPr>
+        <w:t xml:space="preserve">  |  40 hrs/wk | Jackson, MI</w:t>
+      </w:r>
+    </w:p>
+    <w:p>
+      <w:pPr>
+        <w:pStyle w:val="ListBullet"/>
+        <w:spacing w:after="20" w:before="0"/>
+        <w:ind w:left="283"/>
+      </w:pPr>
+      <w:r>
+        <w:rPr>
+          <w:rFonts w:ascii="Calibri" w:hAnsi="Calibri"/>
+          <w:sz w:val="19"/>
+        </w:rPr>
+        <w:t>Diagnosed and resolved hardware, software, and network connectivity failures using CLI tools and systematic diagnostics — managed repair queue under SLA commitments in a high-volume retail service environment.</w:t>
+      </w:r>
+    </w:p>
+    <w:p>
+      <w:pPr>
+        <w:pStyle w:val="ListBullet"/>
+        <w:spacing w:after="20" w:before="0"/>
+        <w:ind w:left="283"/>
+      </w:pPr>
+      <w:r>
+        <w:rPr>
+          <w:rFonts w:ascii="Calibri" w:hAnsi="Calibri"/>
+          <w:sz w:val="19"/>
+        </w:rPr>
+        <w:t>Configured and repaired desktops, laptops, printers, and mobile devices — hardware installation, component replacement, OS imaging, and software configuration across diverse device types.</w:t>
+      </w:r>
+    </w:p>
+    <w:p>
+      <w:pPr>
+        <w:pStyle w:val="ListBullet"/>
+        <w:spacing w:after="20" w:before="0"/>
+        <w:ind w:left="283"/>
+      </w:pPr>
+      <w:r>
+        <w:rPr>
+          <w:rFonts w:ascii="Calibri" w:hAnsi="Calibri"/>
+          <w:sz w:val="19"/>
+        </w:rPr>
+        <w:t>Communicated technical diagnoses and resolution steps clearly to non-technical users; documented repair processes and outcomes for each ticket in the repair queue.</w:t>
+      </w:r>
+    </w:p>
+    <w:p>
+      <w:pPr>
+        <w:spacing w:before="100" w:after="0"/>
+      </w:pPr>
+      <w:r>
+        <w:rPr>
+          <w:rFonts w:ascii="Calibri" w:hAnsi="Calibri"/>
+          <w:b/>
+          <w:sz w:val="21"/>
+        </w:rPr>
+        <w:t>Computer Service Intern</w:t>
       </w:r>
       <w:r>
         <w:rPr>
@@ -471,9 +553,9 @@
       <w:r>
         <w:rPr>
           <w:rFonts w:ascii="Calibri" w:hAnsi="Calibri"/>
-          <w:sz w:val="19"/>
+          <w:sz w:val="18"/>
         </w:rPr>
-        <w:t>Independent Operations Consultant (2010–2014, 2016–2017, 2020–2021): Delivered operational assessments, vendor selection, process documentation, and compliance infrastructure for SMBs in logistics, legal services, and hospitality. Engagements included TMS evaluation for a regional carrier, SOP development for a multi-location restaurant group, and workflow automation for a legal services firm. (2016–2017 includes staffing placement at Flexible Staffing Services Inc. for Dawson Food Products — warehouse operations.)</w:t>
+        <w:t>The Pointe Bar &amp; Grill — Lead Server / Shift Lead (Apr 2012 – May 2014): Promoted to Operations Manager based on performance.  |  Independent Operations Consultant (2010–2012, 2016–2017, 2020–2021): Delivered operational assessments, vendor selection, process documentation, and compliance infrastructure for SMBs in logistics, legal services, and hospitality. (2016–2017 includes staffing placement at Flexible Staffing Services Inc. for Dawson Food Products — warehouse operations.)</w:t>
       </w:r>
     </w:p>
     <w:p>
@@ -574,7 +656,7 @@
           <w:rFonts w:ascii="Calibri" w:hAnsi="Calibri"/>
           <w:sz w:val="17"/>
         </w:rPr>
-        <w:t>Automation &amp; Scripting: PowerShell, VBScript, WMI, psexec, Excel VBA (Advanced P&amp;L Modeling)  |  TMS / ERP: VehicHaul, AscendTMS  |  Legal Tech: PracticePanther, LawPay, MiFILE  |  Fleet &amp; MDM: BigRoad DashLink, Samsung Knox  |  Productivity: Google Workspace, Microsoft Office (Advanced Excel)  |  Modern Tooling: LLM Prompt Engineering (Claude, ChatGPT), AI-Augmented Document Processing, Workflow Automation Design</w:t>
+        <w:t>Hardware &amp; OS: Desktop/laptop repair, component replacement, OS imaging, Windows, CLI diagnostics  |  Automation &amp; Scripting: PowerShell, VBScript, WMI, psexec, Excel VBA (Advanced P&amp;L Modeling)  |  TMS / ERP: VehicHaul, AscendTMS  |  Legal Tech: PracticePanther, LawPay, MiFILE  |  Fleet &amp; MDM: BigRoad DashLink, Samsung Knox  |  Productivity: Google Workspace, Microsoft Office (Advanced Excel)  |  Modern Tooling: LLM Prompt Engineering (Claude, ChatGPT), AI-Augmented Document Processing, Workflow Automation Design</w:t>
       </w:r>
     </w:p>
     <w:sectPr>

</xml_diff>